<commit_message>
docs: clarify GitHub planning as weekly outcome
</commit_message>
<xml_diff>
--- a/docs/meeting-notes/PayloadLab_주간_진행_보고서_2026-09-11.docx
+++ b/docs/meeting-notes/PayloadLab_주간_진행_보고서_2026-09-11.docx
@@ -28,7 +28,7 @@
           <w:color w:val="595959"/>
           <w:sz w:val="21"/>
         </w:rPr>
-        <w:t>보고 기간  2026-09-01 ~ 2026-09-11   |   전체 상태  정상 진행</w:t>
+        <w:t>보고 기간  2026-09-01 ~ 2026-09-11   |   전체 상태  정상 진행  |  기획안은 교수님 검토 전</w:t>
       </w:r>
     </w:p>
     <w:p>
@@ -51,7 +51,7 @@
           <w:color w:val="000000"/>
           <w:sz w:val="21"/>
         </w:rPr>
-        <w:t>보안 입문자를 위한 학습 서비스의 목적, 화면 흐름, 초기 범위를 문서로 정리하고 1차·2차 MVP 및 최종 결과물의 기준을 설계했습니다.</w:t>
+        <w:t>프로젝트를 시작하기 위한 GitHub 운영 구조와 문서 체계를 설계하고, 1차·2차 MVP 및 최종 결과물은 팀 내부 기획 초안으로 정리했습니다.</w:t>
       </w:r>
     </w:p>
     <w:p>
@@ -80,7 +80,7 @@
           <w:color w:val="000000"/>
           <w:sz w:val="21"/>
         </w:rPr>
-        <w:t>프로젝트 문서와 작업 흐름을 정리했습니다. 기획, 자료조사, 의사결정, 회의 기록을 docs에 나누고, 할 일과 논의는 Issue, 결과물 변경은 Pull Request로 연결하는 기준을 마련했습니다.</w:t>
+        <w:t>프로젝트를 위한 GitHub 운영 구조를 설계했습니다. 할 일과 논의는 Issue, 조사·결정 근거는 docs, 실제 변경은 Pull Request로 연결하고, 역할·Assignee·주간 보고를 같은 흐름에서 확인하도록 정리했습니다.</w:t>
       </w:r>
     </w:p>
     <w:p>
@@ -95,7 +95,7 @@
           <w:color w:val="000000"/>
           <w:sz w:val="21"/>
         </w:rPr>
-        <w:t>1차 MVP의 학습 흐름을 설계했습니다. 사용자는 공격 유형과 난이도를 고르고 입력을 시도한 뒤, 교육용 코드·쿼리에 결합된 입력값, Lens의 실수 위치·이유 설명, 결과 다이어그램을 보며 다시 입력을 고칩니다.</w:t>
+        <w:t>문서와 보고서 체계를 설계했습니다. 기획, 자료조사, 의사결정, 회의·교수님 보고 문서를 분리하고, 이후 매주 복제해 쓸 주간 보고 공용 양식을 마련했습니다.</w:t>
       </w:r>
     </w:p>
     <w:p>
@@ -110,7 +110,7 @@
           <w:color w:val="000000"/>
           <w:sz w:val="21"/>
         </w:rPr>
-        <w:t>단계별 범위와 최종 결과물 기대치를 분리했습니다. SQL Injection·Reflected XSS·IDOR의 입문 학습 흐름을 먼저 검증하고, SSRF 모의 시나리오와 리눅스 명령어 빈칸 퀴즈는 다음 단계 후보로 검토합니다.</w:t>
+        <w:t>1차 MVP의 화면 흐름과 단계별 범위를 팀 내부 기획 초안으로 정리했습니다. 사용자는 유형과 난이도를 고르고 입력한 뒤, Lens와 결과 다이어그램을 보며 다시 입력을 고치는 흐름을 우선 검토합니다.</w:t>
       </w:r>
     </w:p>
     <w:p>
@@ -124,7 +124,21 @@
           <w:color w:val="000000"/>
           <w:sz w:val="26"/>
         </w:rPr>
-        <w:t>2. 단계별 결과물 설계</w:t>
+        <w:t>2. 팀 내부 단계별 결과물 계획</w:t>
+      </w:r>
+    </w:p>
+    <w:p>
+      <w:pPr>
+        <w:spacing w:after="100" w:line="300" w:lineRule="auto"/>
+      </w:pPr>
+      <w:r>
+        <w:rPr>
+          <w:rFonts w:ascii="Malgun Gothic" w:hAnsi="Malgun Gothic" w:eastAsia="Malgun Gothic"/>
+          <w:b w:val="0"/>
+          <w:color w:val="000000"/>
+          <w:sz w:val="21"/>
+        </w:rPr>
+        <w:t>아래 범위는 팀 내부 기획 초안이며, 교수님 검토와 이후 자료조사 결과에 따라 조정합니다.</w:t>
       </w:r>
     </w:p>
     <w:tbl>
@@ -602,7 +616,7 @@
           <w:color w:val="000000"/>
           <w:sz w:val="26"/>
         </w:rPr>
-        <w:t>3. 토의를 통해 정리된 방향</w:t>
+        <w:t>3. 팀 내부 토의를 통해 정리한 가설</w:t>
       </w:r>
     </w:p>
     <w:tbl>
@@ -1354,6 +1368,117 @@
                 <w:color w:val="000000"/>
                 <w:sz w:val="19"/>
               </w:rPr>
+              <w:t>1차 MVP 범위에 대한 교수님 의견</w:t>
+            </w:r>
+          </w:p>
+        </w:tc>
+        <w:tc>
+          <w:tcPr>
+            <w:tcW w:type="dxa" w:w="2880"/>
+            <w:vAlign w:val="center"/>
+            <w:tcMar>
+              <w:top w:w="100" w:type="dxa"/>
+              <w:start w:w="120" w:type="dxa"/>
+              <w:bottom w:w="100" w:type="dxa"/>
+              <w:end w:w="120" w:type="dxa"/>
+            </w:tcMar>
+            <w:tcBorders>
+              <w:top w:val="single" w:sz="6" w:space="0" w:color="D9D9D9"/>
+              <w:left w:val="single" w:sz="6" w:space="0" w:color="D9D9D9"/>
+              <w:bottom w:val="single" w:sz="6" w:space="0" w:color="D9D9D9"/>
+              <w:right w:val="single" w:sz="6" w:space="0" w:color="D9D9D9"/>
+              <w:insideH w:val="single" w:sz="6" w:space="0" w:color="D9D9D9"/>
+              <w:insideV w:val="single" w:sz="6" w:space="0" w:color="D9D9D9"/>
+            </w:tcBorders>
+          </w:tcPr>
+          <w:p>
+            <w:pPr>
+              <w:spacing w:after="0" w:line="276" w:lineRule="auto"/>
+              <w:jc w:val="left"/>
+            </w:pPr>
+            <w:r/>
+            <w:r>
+              <w:rPr>
+                <w:rFonts w:ascii="Malgun Gothic" w:hAnsi="Malgun Gothic" w:eastAsia="Malgun Gothic"/>
+                <w:b w:val="0"/>
+                <w:color w:val="000000"/>
+                <w:sz w:val="19"/>
+              </w:rPr>
+              <w:t>팀 내부 기획 초안 단계</w:t>
+            </w:r>
+          </w:p>
+        </w:tc>
+        <w:tc>
+          <w:tcPr>
+            <w:tcW w:type="dxa" w:w="3888"/>
+            <w:vAlign w:val="center"/>
+            <w:tcMar>
+              <w:top w:w="100" w:type="dxa"/>
+              <w:start w:w="120" w:type="dxa"/>
+              <w:bottom w:w="100" w:type="dxa"/>
+              <w:end w:w="120" w:type="dxa"/>
+            </w:tcMar>
+            <w:tcBorders>
+              <w:top w:val="single" w:sz="6" w:space="0" w:color="D9D9D9"/>
+              <w:left w:val="single" w:sz="6" w:space="0" w:color="D9D9D9"/>
+              <w:bottom w:val="single" w:sz="6" w:space="0" w:color="D9D9D9"/>
+              <w:right w:val="single" w:sz="6" w:space="0" w:color="D9D9D9"/>
+              <w:insideH w:val="single" w:sz="6" w:space="0" w:color="D9D9D9"/>
+              <w:insideV w:val="single" w:sz="6" w:space="0" w:color="D9D9D9"/>
+            </w:tcBorders>
+          </w:tcPr>
+          <w:p>
+            <w:pPr>
+              <w:spacing w:after="0" w:line="276" w:lineRule="auto"/>
+              <w:jc w:val="left"/>
+            </w:pPr>
+            <w:r/>
+            <w:r>
+              <w:rPr>
+                <w:rFonts w:ascii="Malgun Gothic" w:hAnsi="Malgun Gothic" w:eastAsia="Malgun Gothic"/>
+                <w:b w:val="0"/>
+                <w:color w:val="000000"/>
+                <w:sz w:val="19"/>
+              </w:rPr>
+              <w:t>교수님 검토를 통해 우선순위와 범위를 보완</w:t>
+            </w:r>
+          </w:p>
+        </w:tc>
+      </w:tr>
+      <w:tr>
+        <w:tc>
+          <w:tcPr>
+            <w:tcW w:type="dxa" w:w="3311"/>
+            <w:shd w:fill="F4F8FC"/>
+            <w:vAlign w:val="center"/>
+            <w:tcMar>
+              <w:top w:w="100" w:type="dxa"/>
+              <w:start w:w="120" w:type="dxa"/>
+              <w:bottom w:w="100" w:type="dxa"/>
+              <w:end w:w="120" w:type="dxa"/>
+            </w:tcMar>
+            <w:tcBorders>
+              <w:top w:val="single" w:sz="6" w:space="0" w:color="D9D9D9"/>
+              <w:left w:val="single" w:sz="6" w:space="0" w:color="D9D9D9"/>
+              <w:bottom w:val="single" w:sz="6" w:space="0" w:color="D9D9D9"/>
+              <w:right w:val="single" w:sz="6" w:space="0" w:color="D9D9D9"/>
+              <w:insideH w:val="single" w:sz="6" w:space="0" w:color="D9D9D9"/>
+              <w:insideV w:val="single" w:sz="6" w:space="0" w:color="D9D9D9"/>
+            </w:tcBorders>
+          </w:tcPr>
+          <w:p>
+            <w:pPr>
+              <w:spacing w:after="0" w:line="276" w:lineRule="auto"/>
+              <w:jc w:val="left"/>
+            </w:pPr>
+            <w:r/>
+            <w:r>
+              <w:rPr>
+                <w:rFonts w:ascii="Malgun Gothic" w:hAnsi="Malgun Gothic" w:eastAsia="Malgun Gothic"/>
+                <w:b w:val="0"/>
+                <w:color w:val="000000"/>
+                <w:sz w:val="19"/>
+              </w:rPr>
               <w:t>유형별 Easy·Medium 기준과 학습 범위의 근거 문서화</w:t>
             </w:r>
           </w:p>
@@ -1361,6 +1486,7 @@
         <w:tc>
           <w:tcPr>
             <w:tcW w:type="dxa" w:w="2880"/>
+            <w:shd w:fill="F4F8FC"/>
             <w:vAlign w:val="center"/>
             <w:tcMar>
               <w:top w:w="100" w:type="dxa"/>
@@ -1397,6 +1523,7 @@
         <w:tc>
           <w:tcPr>
             <w:tcW w:type="dxa" w:w="3888"/>
+            <w:shd w:fill="F4F8FC"/>
             <w:vAlign w:val="center"/>
             <w:tcMar>
               <w:top w:w="100" w:type="dxa"/>
@@ -1435,7 +1562,6 @@
         <w:tc>
           <w:tcPr>
             <w:tcW w:type="dxa" w:w="3311"/>
-            <w:shd w:fill="F4F8FC"/>
             <w:vAlign w:val="center"/>
             <w:tcMar>
               <w:top w:w="100" w:type="dxa"/>
@@ -1472,7 +1598,6 @@
         <w:tc>
           <w:tcPr>
             <w:tcW w:type="dxa" w:w="2880"/>
-            <w:shd w:fill="F4F8FC"/>
             <w:vAlign w:val="center"/>
             <w:tcMar>
               <w:top w:w="100" w:type="dxa"/>
@@ -1509,7 +1634,6 @@
         <w:tc>
           <w:tcPr>
             <w:tcW w:type="dxa" w:w="3888"/>
-            <w:shd w:fill="F4F8FC"/>
             <w:vAlign w:val="center"/>
             <w:tcMar>
               <w:top w:w="100" w:type="dxa"/>
@@ -1548,6 +1672,7 @@
         <w:tc>
           <w:tcPr>
             <w:tcW w:type="dxa" w:w="3311"/>
+            <w:shd w:fill="F4F8FC"/>
             <w:vAlign w:val="center"/>
             <w:tcMar>
               <w:top w:w="100" w:type="dxa"/>
@@ -1584,6 +1709,7 @@
         <w:tc>
           <w:tcPr>
             <w:tcW w:type="dxa" w:w="2880"/>
+            <w:shd w:fill="F4F8FC"/>
             <w:vAlign w:val="center"/>
             <w:tcMar>
               <w:top w:w="100" w:type="dxa"/>
@@ -1620,6 +1746,7 @@
         <w:tc>
           <w:tcPr>
             <w:tcW w:type="dxa" w:w="3888"/>
+            <w:shd w:fill="F4F8FC"/>
             <w:vAlign w:val="center"/>
             <w:tcMar>
               <w:top w:w="100" w:type="dxa"/>
@@ -1686,7 +1813,22 @@
           <w:color w:val="000000"/>
           <w:sz w:val="21"/>
         </w:rPr>
-        <w:t>1차 MVP의 세 유형에 대해 학습 목표, Easy·Medium 구분, 입력 예시, Lens 설명 기준을 문서로 확정합니다.</w:t>
+        <w:t>1차 MVP의 범위와 우선순위에 대한 교수님 의견을 확인하고, 팀 내부 기획 초안을 보완합니다.</w:t>
+      </w:r>
+    </w:p>
+    <w:p>
+      <w:pPr>
+        <w:pStyle w:val="ListBullet"/>
+        <w:spacing w:after="60" w:line="288" w:lineRule="auto"/>
+      </w:pPr>
+      <w:r>
+        <w:rPr>
+          <w:rFonts w:ascii="Malgun Gothic" w:hAnsi="Malgun Gothic" w:eastAsia="Malgun Gothic"/>
+          <w:b w:val="0"/>
+          <w:color w:val="000000"/>
+          <w:sz w:val="21"/>
+        </w:rPr>
+        <w:t>세 유형에 대해 학습 목표, Easy·Medium 구분, 입력 예시, Lens 설명 기준을 자료조사 문서로 구체화합니다.</w:t>
       </w:r>
     </w:p>
     <w:p>

</xml_diff>